<commit_message>
docs: add api docs screenshot placeholder in report
</commit_message>
<xml_diff>
--- a/nsosyal_inovasyon_teknik_raporu.docx
+++ b/nsosyal_inovasyon_teknik_raporu.docx
@@ -1022,6 +1022,11 @@
       </w:r>
       <w:r>
         <w:t xml:space="preserve"> Geliştirilen tüm yapay zeka modülleri ve iskelet tasarımlar yerel olarak test edilip doğrulandıktan sonra uzak depoya push edilmektedir. Değişiklik geçmişi depoda kayıt altındadır.</w:t>
+      </w:r>
+    </w:p>
+    <w:p>
+      <w:r>
+        <w:t>!FastAPI Swagger API Dokümantasyonu Arayüzü</w:t>
       </w:r>
     </w:p>
     <w:p>

</xml_diff>

<commit_message>
docs: add api validation test cases for Nez in report
</commit_message>
<xml_diff>
--- a/nsosyal_inovasyon_teknik_raporu.docx
+++ b/nsosyal_inovasyon_teknik_raporu.docx
@@ -1793,6 +1793,345 @@
         <w:t xml:space="preserve"> Antik yapı ile robotik nesnelerin ilişkisi jüri standartlarına uygun şekilde nesnel olarak cümlelere dökülmüştür.</w:t>
       </w:r>
     </w:p>
+    <w:p>
+      <w:pPr>
+        <w:pStyle w:val="Heading3"/>
+      </w:pPr>
+      <w:r>
+        <w:t>3.2.5. API ve Sınır Değerleri Test Senaryoları</w:t>
+      </w:r>
+    </w:p>
+    <w:p>
+      <w:r>
+        <w:t>Geliştirilen backend uç noktalarının kararlılığını ve güvenliğini sağlamak amacıyla Nez'in yönetiminde hazırlanan API doğrulama ve hata işleme (boundary/sınır değer) test senaryoları aşağıdaki gibidir:</w:t>
+      </w:r>
+    </w:p>
+    <w:tbl>
+      <w:tblPr>
+        <w:tblStyle w:val="TableGrid"/>
+        <w:tblW w:type="auto" w:w="0"/>
+        <w:tblLook w:firstColumn="1" w:firstRow="1" w:lastColumn="0" w:lastRow="0" w:noHBand="0" w:noVBand="1" w:val="04A0"/>
+      </w:tblPr>
+      <w:tblGrid>
+        <w:gridCol w:w="1872"/>
+        <w:gridCol w:w="1872"/>
+        <w:gridCol w:w="1872"/>
+        <w:gridCol w:w="1872"/>
+        <w:gridCol w:w="1872"/>
+      </w:tblGrid>
+      <w:tr>
+        <w:tc>
+          <w:tcPr>
+            <w:tcW w:type="dxa" w:w="1872"/>
+          </w:tcPr>
+          <w:p>
+            <w:r>
+              <w:t>Test ID</w:t>
+            </w:r>
+          </w:p>
+        </w:tc>
+        <w:tc>
+          <w:tcPr>
+            <w:tcW w:type="dxa" w:w="1872"/>
+          </w:tcPr>
+          <w:p>
+            <w:r>
+              <w:t>Test Edilen Durum</w:t>
+            </w:r>
+          </w:p>
+        </w:tc>
+        <w:tc>
+          <w:tcPr>
+            <w:tcW w:type="dxa" w:w="1872"/>
+          </w:tcPr>
+          <w:p>
+            <w:r>
+              <w:t>Girdi (Payload)</w:t>
+            </w:r>
+          </w:p>
+        </w:tc>
+        <w:tc>
+          <w:tcPr>
+            <w:tcW w:type="dxa" w:w="1872"/>
+          </w:tcPr>
+          <w:p>
+            <w:r>
+              <w:t>Beklenen Durum (HTTP)</w:t>
+            </w:r>
+          </w:p>
+        </w:tc>
+        <w:tc>
+          <w:tcPr>
+            <w:tcW w:type="dxa" w:w="1872"/>
+          </w:tcPr>
+          <w:p>
+            <w:r>
+              <w:t>Beklenen Hata Mesajı / Yanıt</w:t>
+            </w:r>
+          </w:p>
+        </w:tc>
+      </w:tr>
+      <w:tr>
+        <w:tc>
+          <w:tcPr>
+            <w:tcW w:type="dxa" w:w="1872"/>
+          </w:tcPr>
+          <w:p>
+            <w:r>
+              <w:t>TS_01</w:t>
+            </w:r>
+          </w:p>
+        </w:tc>
+        <w:tc>
+          <w:tcPr>
+            <w:tcW w:type="dxa" w:w="1872"/>
+          </w:tcPr>
+          <w:p>
+            <w:r>
+              <w:t>Geçerli Dosya Analizi (Mutlu Yol)</w:t>
+            </w:r>
+          </w:p>
+        </w:tc>
+        <w:tc>
+          <w:tcPr>
+            <w:tcW w:type="dxa" w:w="1872"/>
+          </w:tcPr>
+          <w:p>
+            <w:r>
+              <w:t>`teknofest_test.jpg` (350 KB, Görsel)</w:t>
+            </w:r>
+          </w:p>
+        </w:tc>
+        <w:tc>
+          <w:tcPr>
+            <w:tcW w:type="dxa" w:w="1872"/>
+          </w:tcPr>
+          <w:p>
+            <w:r>
+              <w:t>`200 OK`</w:t>
+            </w:r>
+          </w:p>
+        </w:tc>
+        <w:tc>
+          <w:tcPr>
+            <w:tcW w:type="dxa" w:w="1872"/>
+          </w:tcPr>
+          <w:p>
+            <w:r>
+              <w:t>`durum: "basarili"`, `otomatik_alt_text` betimlemesi.</w:t>
+            </w:r>
+          </w:p>
+        </w:tc>
+      </w:tr>
+      <w:tr>
+        <w:tc>
+          <w:tcPr>
+            <w:tcW w:type="dxa" w:w="1872"/>
+          </w:tcPr>
+          <w:p>
+            <w:r>
+              <w:t>TS_02</w:t>
+            </w:r>
+          </w:p>
+        </w:tc>
+        <w:tc>
+          <w:tcPr>
+            <w:tcW w:type="dxa" w:w="1872"/>
+          </w:tcPr>
+          <w:p>
+            <w:r>
+              <w:t>Boş Dosya Gönderimi</w:t>
+            </w:r>
+          </w:p>
+        </w:tc>
+        <w:tc>
+          <w:tcPr>
+            <w:tcW w:type="dxa" w:w="1872"/>
+          </w:tcPr>
+          <w:p>
+            <w:r>
+              <w:t>`bos_dosya.jpg` (0 byte)</w:t>
+            </w:r>
+          </w:p>
+        </w:tc>
+        <w:tc>
+          <w:tcPr>
+            <w:tcW w:type="dxa" w:w="1872"/>
+          </w:tcPr>
+          <w:p>
+            <w:r>
+              <w:t>`400 Bad Request`</w:t>
+            </w:r>
+          </w:p>
+        </w:tc>
+        <w:tc>
+          <w:tcPr>
+            <w:tcW w:type="dxa" w:w="1872"/>
+          </w:tcPr>
+          <w:p>
+            <w:r>
+              <w:t>`detail: "Dosya boş görünüyor. Lütfen geçerli bir dosya gönderin."`</w:t>
+            </w:r>
+          </w:p>
+        </w:tc>
+      </w:tr>
+      <w:tr>
+        <w:tc>
+          <w:tcPr>
+            <w:tcW w:type="dxa" w:w="1872"/>
+          </w:tcPr>
+          <w:p>
+            <w:r>
+              <w:t>TS_03</w:t>
+            </w:r>
+          </w:p>
+        </w:tc>
+        <w:tc>
+          <w:tcPr>
+            <w:tcW w:type="dxa" w:w="1872"/>
+          </w:tcPr>
+          <w:p>
+            <w:r>
+              <w:t>Desteklenmeyen Format</w:t>
+            </w:r>
+          </w:p>
+        </w:tc>
+        <w:tc>
+          <w:tcPr>
+            <w:tcW w:type="dxa" w:w="1872"/>
+          </w:tcPr>
+          <w:p>
+            <w:r>
+              <w:t>`belge.pdf` (PDF dosyası)</w:t>
+            </w:r>
+          </w:p>
+        </w:tc>
+        <w:tc>
+          <w:tcPr>
+            <w:tcW w:type="dxa" w:w="1872"/>
+          </w:tcPr>
+          <w:p>
+            <w:r>
+              <w:t>`415 Unsupported Type`</w:t>
+            </w:r>
+          </w:p>
+        </w:tc>
+        <w:tc>
+          <w:tcPr>
+            <w:tcW w:type="dxa" w:w="1872"/>
+          </w:tcPr>
+          <w:p>
+            <w:r>
+              <w:t>`detail: "Desteklenmeyen dosya türü: application/pdf..."`</w:t>
+            </w:r>
+          </w:p>
+        </w:tc>
+      </w:tr>
+      <w:tr>
+        <w:tc>
+          <w:tcPr>
+            <w:tcW w:type="dxa" w:w="1872"/>
+          </w:tcPr>
+          <w:p>
+            <w:r>
+              <w:t>TS_04</w:t>
+            </w:r>
+          </w:p>
+        </w:tc>
+        <w:tc>
+          <w:tcPr>
+            <w:tcW w:type="dxa" w:w="1872"/>
+          </w:tcPr>
+          <w:p>
+            <w:r>
+              <w:t>Aşırı Büyük Dosya</w:t>
+            </w:r>
+          </w:p>
+        </w:tc>
+        <w:tc>
+          <w:tcPr>
+            <w:tcW w:type="dxa" w:w="1872"/>
+          </w:tcPr>
+          <w:p>
+            <w:r>
+              <w:t>`buyuk_video.mp4` (&gt; 25 MB)</w:t>
+            </w:r>
+          </w:p>
+        </w:tc>
+        <w:tc>
+          <w:tcPr>
+            <w:tcW w:type="dxa" w:w="1872"/>
+          </w:tcPr>
+          <w:p>
+            <w:r>
+              <w:t>`413 Entity Too Large`</w:t>
+            </w:r>
+          </w:p>
+        </w:tc>
+        <w:tc>
+          <w:tcPr>
+            <w:tcW w:type="dxa" w:w="1872"/>
+          </w:tcPr>
+          <w:p>
+            <w:r>
+              <w:t>`detail: "Dosya çok büyük. En fazla 25 MB kabul edilir."`</w:t>
+            </w:r>
+          </w:p>
+        </w:tc>
+      </w:tr>
+      <w:tr>
+        <w:tc>
+          <w:tcPr>
+            <w:tcW w:type="dxa" w:w="1872"/>
+          </w:tcPr>
+          <w:p>
+            <w:r>
+              <w:t>TS_05</w:t>
+            </w:r>
+          </w:p>
+        </w:tc>
+        <w:tc>
+          <w:tcPr>
+            <w:tcW w:type="dxa" w:w="1872"/>
+          </w:tcPr>
+          <w:p>
+            <w:r>
+              <w:t>Misafir/Yetkisiz Giriş</w:t>
+            </w:r>
+          </w:p>
+        </w:tc>
+        <w:tc>
+          <w:tcPr>
+            <w:tcW w:type="dxa" w:w="1872"/>
+          </w:tcPr>
+          <w:p>
+            <w:r>
+              <w:t>Token olmadan API isteği</w:t>
+            </w:r>
+          </w:p>
+        </w:tc>
+        <w:tc>
+          <w:tcPr>
+            <w:tcW w:type="dxa" w:w="1872"/>
+          </w:tcPr>
+          <w:p>
+            <w:r>
+              <w:t>`200 OK` (Misafir Modu)</w:t>
+            </w:r>
+          </w:p>
+        </w:tc>
+        <w:tc>
+          <w:tcPr>
+            <w:tcW w:type="dxa" w:w="1872"/>
+          </w:tcPr>
+          <w:p>
+            <w:r>
+              <w:t>İstek başarıyla işlenir ancak veritabanında `user_id: null` olarak işaretlenir.</w:t>
+            </w:r>
+          </w:p>
+        </w:tc>
+      </w:tr>
+    </w:tbl>
     <w:p>
       <w:r/>
       <w:r>

</xml_diff>